<commit_message>
Updated styling in some notebooks and updated final report.
</commit_message>
<xml_diff>
--- a/report/DS4400_Valorant_Final_Report.docx
+++ b/report/DS4400_Valorant_Final_Report.docx
@@ -332,7 +332,16 @@
         <w:spacing w:after="120"/>
       </w:pPr>
       <w:r>
-        <w:t>The feedforward neural network was implemented in TensorFlow and Keras, following the style of the course neural network notebook. It used an input layer sized to the preprocessed feature dimension, a Dense layer of 128 units with ReLU activation, a Dropout layer with rate 0.25, a Dense layer of 64 units with ReLU activation, a Dropout layer with rate 0.20, and a single unit sigmoid output. It was trained with the Adam optimizer, binary crossentropy loss, batch size 256, and up to 20 epochs, with an early stopping callback that monitored validation loss with patience 3 and restored the best weights.</w:t>
+        <w:t>The feedforward neural network was implemented in TensorFlow and Keras</w:t>
+      </w:r>
+      <w:r>
+        <w:t>.</w:t>
+      </w:r>
+      <w:r>
+        <w:t xml:space="preserve"> We initially planned to implement the neural network in PyTorch, but we later decided that it would make more sense to use TensorFlow as we could use the notebook from the class Canvas as groundwork.</w:t>
+      </w:r>
+      <w:r>
+        <w:t xml:space="preserve"> It used an input layer sized to the preprocessed feature dimension, a Dense layer of 128 units with ReLU activation, a Dropout layer with rate 0.25, a Dense layer of 64 units with ReLU activation, a Dropout layer with rate 0.20, and a single unit sigmoid output. It was trained with the Adam optimizer, binary crossentropy loss, batch size 256, and up to 20 epochs, with an early stopping callback that monitored validation loss with patience 3 and restored the best weights.</w:t>
       </w:r>
     </w:p>
     <w:p>
@@ -1037,12 +1046,6 @@
         <w:gridCol w:w="860"/>
       </w:tblGrid>
       <w:tr>
-        <w:tblPrEx>
-          <w:tblCellMar>
-            <w:top w:w="0" w:type="dxa"/>
-            <w:bottom w:w="0" w:type="dxa"/>
-          </w:tblCellMar>
-        </w:tblPrEx>
         <w:trPr>
           <w:tblHeader/>
         </w:trPr>
@@ -1251,12 +1254,6 @@
         </w:tc>
       </w:tr>
       <w:tr>
-        <w:tblPrEx>
-          <w:tblCellMar>
-            <w:top w:w="0" w:type="dxa"/>
-            <w:bottom w:w="0" w:type="dxa"/>
-          </w:tblCellMar>
-        </w:tblPrEx>
         <w:tc>
           <w:tcPr>
             <w:tcW w:w="1900" w:type="dxa"/>
@@ -1441,12 +1438,6 @@
         </w:tc>
       </w:tr>
       <w:tr>
-        <w:tblPrEx>
-          <w:tblCellMar>
-            <w:top w:w="0" w:type="dxa"/>
-            <w:bottom w:w="0" w:type="dxa"/>
-          </w:tblCellMar>
-        </w:tblPrEx>
         <w:tc>
           <w:tcPr>
             <w:tcW w:w="1900" w:type="dxa"/>
@@ -1631,12 +1622,6 @@
         </w:tc>
       </w:tr>
       <w:tr>
-        <w:tblPrEx>
-          <w:tblCellMar>
-            <w:top w:w="0" w:type="dxa"/>
-            <w:bottom w:w="0" w:type="dxa"/>
-          </w:tblCellMar>
-        </w:tblPrEx>
         <w:tc>
           <w:tcPr>
             <w:tcW w:w="1900" w:type="dxa"/>
@@ -1821,12 +1806,6 @@
         </w:tc>
       </w:tr>
       <w:tr>
-        <w:tblPrEx>
-          <w:tblCellMar>
-            <w:top w:w="0" w:type="dxa"/>
-            <w:bottom w:w="0" w:type="dxa"/>
-          </w:tblCellMar>
-        </w:tblPrEx>
         <w:tc>
           <w:tcPr>
             <w:tcW w:w="1900" w:type="dxa"/>
@@ -2011,12 +1990,6 @@
         </w:tc>
       </w:tr>
       <w:tr>
-        <w:tblPrEx>
-          <w:tblCellMar>
-            <w:top w:w="0" w:type="dxa"/>
-            <w:bottom w:w="0" w:type="dxa"/>
-          </w:tblCellMar>
-        </w:tblPrEx>
         <w:tc>
           <w:tcPr>
             <w:tcW w:w="1900" w:type="dxa"/>
@@ -2245,12 +2218,6 @@
         <w:gridCol w:w="860"/>
       </w:tblGrid>
       <w:tr>
-        <w:tblPrEx>
-          <w:tblCellMar>
-            <w:top w:w="0" w:type="dxa"/>
-            <w:bottom w:w="0" w:type="dxa"/>
-          </w:tblCellMar>
-        </w:tblPrEx>
         <w:trPr>
           <w:tblHeader/>
         </w:trPr>
@@ -2459,12 +2426,6 @@
         </w:tc>
       </w:tr>
       <w:tr>
-        <w:tblPrEx>
-          <w:tblCellMar>
-            <w:top w:w="0" w:type="dxa"/>
-            <w:bottom w:w="0" w:type="dxa"/>
-          </w:tblCellMar>
-        </w:tblPrEx>
         <w:tc>
           <w:tcPr>
             <w:tcW w:w="1900" w:type="dxa"/>
@@ -2649,12 +2610,6 @@
         </w:tc>
       </w:tr>
       <w:tr>
-        <w:tblPrEx>
-          <w:tblCellMar>
-            <w:top w:w="0" w:type="dxa"/>
-            <w:bottom w:w="0" w:type="dxa"/>
-          </w:tblCellMar>
-        </w:tblPrEx>
         <w:tc>
           <w:tcPr>
             <w:tcW w:w="1900" w:type="dxa"/>
@@ -2839,12 +2794,6 @@
         </w:tc>
       </w:tr>
       <w:tr>
-        <w:tblPrEx>
-          <w:tblCellMar>
-            <w:top w:w="0" w:type="dxa"/>
-            <w:bottom w:w="0" w:type="dxa"/>
-          </w:tblCellMar>
-        </w:tblPrEx>
         <w:tc>
           <w:tcPr>
             <w:tcW w:w="1900" w:type="dxa"/>
@@ -3029,12 +2978,6 @@
         </w:tc>
       </w:tr>
       <w:tr>
-        <w:tblPrEx>
-          <w:tblCellMar>
-            <w:top w:w="0" w:type="dxa"/>
-            <w:bottom w:w="0" w:type="dxa"/>
-          </w:tblCellMar>
-        </w:tblPrEx>
         <w:tc>
           <w:tcPr>
             <w:tcW w:w="1900" w:type="dxa"/>
@@ -3219,12 +3162,6 @@
         </w:tc>
       </w:tr>
       <w:tr>
-        <w:tblPrEx>
-          <w:tblCellMar>
-            <w:top w:w="0" w:type="dxa"/>
-            <w:bottom w:w="0" w:type="dxa"/>
-          </w:tblCellMar>
-        </w:tblPrEx>
         <w:tc>
           <w:tcPr>
             <w:tcW w:w="1900" w:type="dxa"/>
@@ -3454,12 +3391,6 @@
         <w:gridCol w:w="1260"/>
       </w:tblGrid>
       <w:tr>
-        <w:tblPrEx>
-          <w:tblCellMar>
-            <w:top w:w="0" w:type="dxa"/>
-            <w:bottom w:w="0" w:type="dxa"/>
-          </w:tblCellMar>
-        </w:tblPrEx>
         <w:trPr>
           <w:tblHeader/>
         </w:trPr>
@@ -3697,12 +3628,6 @@
         </w:tc>
       </w:tr>
       <w:tr>
-        <w:tblPrEx>
-          <w:tblCellMar>
-            <w:top w:w="0" w:type="dxa"/>
-            <w:bottom w:w="0" w:type="dxa"/>
-          </w:tblCellMar>
-        </w:tblPrEx>
         <w:tc>
           <w:tcPr>
             <w:tcW w:w="2200" w:type="dxa"/>
@@ -3952,12 +3877,6 @@
         <w:gridCol w:w="4360"/>
       </w:tblGrid>
       <w:tr>
-        <w:tblPrEx>
-          <w:tblCellMar>
-            <w:top w:w="0" w:type="dxa"/>
-            <w:bottom w:w="0" w:type="dxa"/>
-          </w:tblCellMar>
-        </w:tblPrEx>
         <w:trPr>
           <w:tblHeader/>
         </w:trPr>
@@ -4021,12 +3940,6 @@
         </w:tc>
       </w:tr>
       <w:tr>
-        <w:tblPrEx>
-          <w:tblCellMar>
-            <w:top w:w="0" w:type="dxa"/>
-            <w:bottom w:w="0" w:type="dxa"/>
-          </w:tblCellMar>
-        </w:tblPrEx>
         <w:tc>
           <w:tcPr>
             <w:tcW w:w="5000" w:type="dxa"/>
@@ -4081,12 +3994,6 @@
         </w:tc>
       </w:tr>
       <w:tr>
-        <w:tblPrEx>
-          <w:tblCellMar>
-            <w:top w:w="0" w:type="dxa"/>
-            <w:bottom w:w="0" w:type="dxa"/>
-          </w:tblCellMar>
-        </w:tblPrEx>
         <w:tc>
           <w:tcPr>
             <w:tcW w:w="5000" w:type="dxa"/>
@@ -4141,12 +4048,6 @@
         </w:tc>
       </w:tr>
       <w:tr>
-        <w:tblPrEx>
-          <w:tblCellMar>
-            <w:top w:w="0" w:type="dxa"/>
-            <w:bottom w:w="0" w:type="dxa"/>
-          </w:tblCellMar>
-        </w:tblPrEx>
         <w:tc>
           <w:tcPr>
             <w:tcW w:w="5000" w:type="dxa"/>
@@ -4201,12 +4102,6 @@
         </w:tc>
       </w:tr>
       <w:tr>
-        <w:tblPrEx>
-          <w:tblCellMar>
-            <w:top w:w="0" w:type="dxa"/>
-            <w:bottom w:w="0" w:type="dxa"/>
-          </w:tblCellMar>
-        </w:tblPrEx>
         <w:tc>
           <w:tcPr>
             <w:tcW w:w="5000" w:type="dxa"/>
@@ -4261,12 +4156,6 @@
         </w:tc>
       </w:tr>
       <w:tr>
-        <w:tblPrEx>
-          <w:tblCellMar>
-            <w:top w:w="0" w:type="dxa"/>
-            <w:bottom w:w="0" w:type="dxa"/>
-          </w:tblCellMar>
-        </w:tblPrEx>
         <w:tc>
           <w:tcPr>
             <w:tcW w:w="5000" w:type="dxa"/>
@@ -4321,12 +4210,6 @@
         </w:tc>
       </w:tr>
       <w:tr>
-        <w:tblPrEx>
-          <w:tblCellMar>
-            <w:top w:w="0" w:type="dxa"/>
-            <w:bottom w:w="0" w:type="dxa"/>
-          </w:tblCellMar>
-        </w:tblPrEx>
         <w:tc>
           <w:tcPr>
             <w:tcW w:w="5000" w:type="dxa"/>
@@ -4381,12 +4264,6 @@
         </w:tc>
       </w:tr>
       <w:tr>
-        <w:tblPrEx>
-          <w:tblCellMar>
-            <w:top w:w="0" w:type="dxa"/>
-            <w:bottom w:w="0" w:type="dxa"/>
-          </w:tblCellMar>
-        </w:tblPrEx>
         <w:tc>
           <w:tcPr>
             <w:tcW w:w="5000" w:type="dxa"/>
@@ -4441,12 +4318,6 @@
         </w:tc>
       </w:tr>
       <w:tr>
-        <w:tblPrEx>
-          <w:tblCellMar>
-            <w:top w:w="0" w:type="dxa"/>
-            <w:bottom w:w="0" w:type="dxa"/>
-          </w:tblCellMar>
-        </w:tblPrEx>
         <w:tc>
           <w:tcPr>
             <w:tcW w:w="5000" w:type="dxa"/>
@@ -4501,12 +4372,6 @@
         </w:tc>
       </w:tr>
       <w:tr>
-        <w:tblPrEx>
-          <w:tblCellMar>
-            <w:top w:w="0" w:type="dxa"/>
-            <w:bottom w:w="0" w:type="dxa"/>
-          </w:tblCellMar>
-        </w:tblPrEx>
         <w:tc>
           <w:tcPr>
             <w:tcW w:w="5000" w:type="dxa"/>
@@ -4561,12 +4426,6 @@
         </w:tc>
       </w:tr>
       <w:tr>
-        <w:tblPrEx>
-          <w:tblCellMar>
-            <w:top w:w="0" w:type="dxa"/>
-            <w:bottom w:w="0" w:type="dxa"/>
-          </w:tblCellMar>
-        </w:tblPrEx>
         <w:tc>
           <w:tcPr>
             <w:tcW w:w="5000" w:type="dxa"/>
@@ -4665,12 +4524,6 @@
         <w:gridCol w:w="1560"/>
       </w:tblGrid>
       <w:tr>
-        <w:tblPrEx>
-          <w:tblCellMar>
-            <w:top w:w="0" w:type="dxa"/>
-            <w:bottom w:w="0" w:type="dxa"/>
-          </w:tblCellMar>
-        </w:tblPrEx>
         <w:trPr>
           <w:tblHeader/>
         </w:trPr>
@@ -4850,12 +4703,6 @@
         </w:tc>
       </w:tr>
       <w:tr>
-        <w:tblPrEx>
-          <w:tblCellMar>
-            <w:top w:w="0" w:type="dxa"/>
-            <w:bottom w:w="0" w:type="dxa"/>
-          </w:tblCellMar>
-        </w:tblPrEx>
         <w:tc>
           <w:tcPr>
             <w:tcW w:w="1600" w:type="dxa"/>
@@ -5014,12 +4861,6 @@
         </w:tc>
       </w:tr>
       <w:tr>
-        <w:tblPrEx>
-          <w:tblCellMar>
-            <w:top w:w="0" w:type="dxa"/>
-            <w:bottom w:w="0" w:type="dxa"/>
-          </w:tblCellMar>
-        </w:tblPrEx>
         <w:tc>
           <w:tcPr>
             <w:tcW w:w="1600" w:type="dxa"/>
@@ -5178,12 +5019,6 @@
         </w:tc>
       </w:tr>
       <w:tr>
-        <w:tblPrEx>
-          <w:tblCellMar>
-            <w:top w:w="0" w:type="dxa"/>
-            <w:bottom w:w="0" w:type="dxa"/>
-          </w:tblCellMar>
-        </w:tblPrEx>
         <w:tc>
           <w:tcPr>
             <w:tcW w:w="1600" w:type="dxa"/>
@@ -5342,12 +5177,6 @@
         </w:tc>
       </w:tr>
       <w:tr>
-        <w:tblPrEx>
-          <w:tblCellMar>
-            <w:top w:w="0" w:type="dxa"/>
-            <w:bottom w:w="0" w:type="dxa"/>
-          </w:tblCellMar>
-        </w:tblPrEx>
         <w:tc>
           <w:tcPr>
             <w:tcW w:w="1600" w:type="dxa"/>
@@ -6191,6 +6020,7 @@
   <w:style w:type="character" w:default="1" w:styleId="DefaultParagraphFont">
     <w:name w:val="Default Paragraph Font"/>
     <w:uiPriority w:val="1"/>
+    <w:semiHidden/>
     <w:unhideWhenUsed/>
   </w:style>
   <w:style w:type="table" w:default="1" w:styleId="TableNormal">

</xml_diff>